<commit_message>
Add article history, DOI, license, copyright and how-to-cite to KIJMS and SPECTRUM templates
Co-Authored-By: Claude Opus 5.5 <noreply@anthropic.com>
Claude-Session: https://claude.ai/code/session_01NgYvcvdxvAujmB7TuVjCBg
</commit_message>
<xml_diff>
--- a/assets/jurnal/template-kijms.docx
+++ b/assets/jurnal/template-kijms.docx
@@ -331,7 +331,7 @@
           </w:tcPr>
           <w:p>
             <w:pPr>
-              <w:jc w:val="both"/>
+              <w:jc w:val="left"/>
               <w:rPr>
                 <w:rFonts w:asciiTheme="majorHAnsi" w:hAnsiTheme="majorHAnsi"/>
                 <w:b/>
@@ -353,7 +353,7 @@
           </w:p>
           <w:p>
             <w:pPr>
-              <w:jc w:val="both"/>
+              <w:jc w:val="left"/>
               <w:rPr>
                 <w:rFonts w:asciiTheme="majorHAnsi" w:hAnsiTheme="majorHAnsi"/>
                 <w:sz w:val="22"/>
@@ -371,7 +371,7 @@
           </w:p>
           <w:p>
             <w:pPr>
-              <w:jc w:val="both"/>
+              <w:jc w:val="left"/>
               <w:rPr>
                 <w:rFonts w:asciiTheme="majorHAnsi" w:hAnsiTheme="majorHAnsi"/>
                 <w:sz w:val="22"/>
@@ -389,7 +389,7 @@
           </w:p>
           <w:p>
             <w:pPr>
-              <w:jc w:val="both"/>
+              <w:jc w:val="left"/>
               <w:rPr>
                 <w:rFonts w:asciiTheme="majorHAnsi" w:hAnsiTheme="majorHAnsi"/>
                 <w:sz w:val="22"/>
@@ -407,7 +407,25 @@
           </w:p>
           <w:p>
             <w:pPr>
-              <w:jc w:val="both"/>
+              <w:jc w:val="left"/>
+              <w:rPr>
+                <w:rFonts w:asciiTheme="majorHAnsi" w:hAnsiTheme="majorHAnsi"/>
+                <w:sz w:val="22"/>
+                <w:szCs w:val="22"/>
+              </w:rPr>
+            </w:pPr>
+            <w:r>
+              <w:rPr>
+                <w:rFonts w:asciiTheme="majorHAnsi" w:hAnsiTheme="majorHAnsi"/>
+                <w:sz w:val="22"/>
+                <w:szCs w:val="22"/>
+              </w:rPr>
+              <w:t xml:space="preserve">Published Mon DD, YYYY</w:t>
+            </w:r>
+          </w:p>
+          <w:p>
+            <w:pPr>
+              <w:jc w:val="left"/>
               <w:rPr>
                 <w:rFonts w:asciiTheme="majorHAnsi" w:hAnsiTheme="majorHAnsi"/>
                 <w:sz w:val="22"/>
@@ -758,7 +776,7 @@
                 <w:sz w:val="18"/>
                 <w:szCs w:val="18"/>
               </w:rPr>
-              <w:t>This is an open access article under the CC BY license.</w:t>
+              <w:t xml:space="preserve">Copyright © 20XX by the Author(s). This is an open access article under the CC BY 4.0 license.</w:t>
             </w:r>
           </w:p>
           <w:p>
@@ -926,6 +944,56 @@
         </w:tc>
       </w:tr>
     </w:tbl>
+    <w:p>
+      <w:pPr>
+        <w:jc w:val="both"/>
+        <w:rPr>
+          <w:rFonts w:asciiTheme="majorHAnsi" w:hAnsiTheme="majorHAnsi"/>
+        </w:rPr>
+      </w:pPr>
+    </w:p>
+    <w:p>
+      <w:pPr>
+        <w:jc w:val="left"/>
+        <w:rPr>
+          <w:rFonts w:asciiTheme="majorHAnsi" w:hAnsiTheme="majorHAnsi"/>
+        </w:rPr>
+      </w:pPr>
+      <w:r>
+        <w:rPr>
+          <w:rFonts w:asciiTheme="majorHAnsi" w:hAnsiTheme="majorHAnsi"/>
+          <w:b/>
+          <w:sz w:val="24"/>
+          <w:szCs w:val="24"/>
+        </w:rPr>
+        <w:t xml:space="preserve">How to cite: </w:t>
+      </w:r>
+      <w:r>
+        <w:rPr>
+          <w:rFonts w:asciiTheme="majorHAnsi" w:hAnsiTheme="majorHAnsi"/>
+          <w:sz w:val="24"/>
+          <w:szCs w:val="24"/>
+        </w:rPr>
+        <w:t xml:space="preserve">Author, A. A., Author, B. B., &amp; Author, C. C. (20XX). Title of the article. </w:t>
+      </w:r>
+      <w:r>
+        <w:rPr>
+          <w:rFonts w:asciiTheme="majorHAnsi" w:hAnsiTheme="majorHAnsi"/>
+          <w:i/>
+          <w:sz w:val="24"/>
+          <w:szCs w:val="24"/>
+        </w:rPr>
+        <w:t xml:space="preserve">Kawanua International Journal of Multicultural Studies, X</w:t>
+      </w:r>
+      <w:r>
+        <w:rPr>
+          <w:rFonts w:asciiTheme="majorHAnsi" w:hAnsiTheme="majorHAnsi"/>
+          <w:sz w:val="24"/>
+          <w:szCs w:val="24"/>
+        </w:rPr>
+        <w:t xml:space="preserve">(X), xx-xx. https://doi.org/10.30984/KIJMS.vXiX.XXXX</w:t>
+      </w:r>
+    </w:p>
     <w:p>
       <w:pPr>
         <w:jc w:val="both"/>

</xml_diff>